<commit_message>
Stop iOS zoom and sideways scroll on phones (mobile phase M0).
Co-authored-by: Cursor <cursoragent@cursor.com>
</commit_message>
<xml_diff>
--- a/docs/ARCHITECTURE.docx
+++ b/docs/ARCHITECTURE.docx
@@ -18,7 +18,7 @@
         <w:t>Last updated:</w:t>
       </w:r>
       <w:r>
-        <w:t xml:space="preserve"> 2026-07-31</w:t>
+        <w:t xml:space="preserve"> 2026-08-11</w:t>
       </w:r>
     </w:p>
     <w:p>
@@ -61,7 +61,38 @@
         <w:t>what Problem Bank is today</w:t>
       </w:r>
       <w:r>
-        <w:t xml:space="preserve">: product goals, system architecture, major features, data model, and how the pieces fit together. For API contracts see </w:t>
+        <w:t>: product goals, system architecture, major features, data model, and how the pieces fit together.</w:t>
+      </w:r>
+    </w:p>
+    <w:p>
+      <w:r>
+        <w:rPr>
+          <w:b/>
+        </w:rPr>
+        <w:t>AI agents:</w:t>
+      </w:r>
+      <w:r>
+        <w:t xml:space="preserve"> start with </w:t>
+      </w:r>
+      <w:r>
+        <w:rPr>
+          <w:rFonts w:ascii="Consolas" w:hAnsi="Consolas"/>
+          <w:sz w:val="20"/>
+        </w:rPr>
+        <w:t>docs/AI_HANDOFF.md</w:t>
+      </w:r>
+      <w:r>
+        <w:t xml:space="preserve">, then this file, then </w:t>
+      </w:r>
+      <w:r>
+        <w:rPr>
+          <w:rFonts w:ascii="Consolas" w:hAnsi="Consolas"/>
+          <w:sz w:val="20"/>
+        </w:rPr>
+        <w:t>docs/SOLID_DRAFT_SECURITY.md</w:t>
+      </w:r>
+      <w:r>
+        <w:t xml:space="preserve"> before changing auth/grading/sessions. API: </w:t>
       </w:r>
       <w:r>
         <w:rPr>
@@ -71,7 +102,7 @@
         <w:t>docs/API.md</w:t>
       </w:r>
       <w:r>
-        <w:t xml:space="preserve">. For deployment see </w:t>
+        <w:t xml:space="preserve">. Deploy: </w:t>
       </w:r>
       <w:r>
         <w:rPr>
@@ -81,7 +112,7 @@
         <w:t>docs/DEPLOY.md</w:t>
       </w:r>
       <w:r>
-        <w:t xml:space="preserve">. For planned work see </w:t>
+        <w:t xml:space="preserve">. Planned work (incl. G8): </w:t>
       </w:r>
       <w:r>
         <w:rPr>
@@ -593,7 +624,17 @@
           <w:p>
             <w:r/>
             <w:r>
-              <w:t>Flask ≥3.0</w:t>
+              <w:t xml:space="preserve">Flask 3.1.x (pinned in </w:t>
+            </w:r>
+            <w:r>
+              <w:rPr>
+                <w:rFonts w:ascii="Consolas" w:hAnsi="Consolas"/>
+                <w:sz w:val="20"/>
+              </w:rPr>
+              <w:t>requirements.txt</w:t>
+            </w:r>
+            <w:r>
+              <w:t>)</w:t>
             </w:r>
           </w:p>
         </w:tc>
@@ -612,9 +653,6 @@
                 <w:sz w:val="20"/>
               </w:rPr>
               <w:t>app.py</w:t>
-            </w:r>
-            <w:r>
-              <w:t xml:space="preserve"> (~7,600 lines)</w:t>
             </w:r>
           </w:p>
         </w:tc>
@@ -652,7 +690,7 @@
           <w:p>
             <w:r/>
             <w:r>
-              <w:t>Session cookies + Bearer API tokens</w:t>
+              <w:t>Session cookies + Bearer API tokens (default 90-day expiry)</w:t>
             </w:r>
           </w:p>
         </w:tc>
@@ -690,6 +728,9 @@
           <w:p>
             <w:r/>
             <w:r>
+              <w:t xml:space="preserve">Local </w:t>
+            </w:r>
+            <w:r>
               <w:rPr>
                 <w:rFonts w:ascii="Consolas" w:hAnsi="Consolas"/>
                 <w:sz w:val="20"/>
@@ -697,7 +738,16 @@
               <w:t>data/quicktest.db</w:t>
             </w:r>
             <w:r>
-              <w:t xml:space="preserve">; schema init inline in </w:t>
+              <w:t xml:space="preserve"> (</w:t>
+            </w:r>
+            <w:r>
+              <w:rPr>
+                <w:b/>
+              </w:rPr>
+              <w:t>gitignored</w:t>
+            </w:r>
+            <w:r>
+              <w:t xml:space="preserve">); schema init inline in </w:t>
             </w:r>
             <w:r>
               <w:rPr>
@@ -705,6 +755,9 @@
                 <w:sz w:val="20"/>
               </w:rPr>
               <w:t>app.py</w:t>
+            </w:r>
+            <w:r>
+              <w:t>; WAL</w:t>
             </w:r>
           </w:p>
         </w:tc>
@@ -731,7 +784,7 @@
           <w:p>
             <w:r/>
             <w:r>
-              <w:t>SymPy ≥1.12</w:t>
+              <w:t>SymPy (pinned)</w:t>
             </w:r>
           </w:p>
         </w:tc>
@@ -742,7 +795,17 @@
           <w:p>
             <w:r/>
             <w:r>
-              <w:t>Symbolic equivalence for algebra, surds, quadratics, etc.</w:t>
+              <w:t xml:space="preserve">Safe allowlisted parsing only — never bare </w:t>
+            </w:r>
+            <w:r>
+              <w:rPr>
+                <w:rFonts w:ascii="Consolas" w:hAnsi="Consolas"/>
+                <w:sz w:val="20"/>
+              </w:rPr>
+              <w:t>sympify</w:t>
+            </w:r>
+            <w:r>
+              <w:t xml:space="preserve"> on untrusted input</w:t>
             </w:r>
           </w:p>
         </w:tc>
@@ -957,7 +1020,33 @@
           <w:p>
             <w:r/>
             <w:r>
-              <w:t>Offline shell; API always network-only</w:t>
+              <w:t xml:space="preserve">Offline shell; API always network-only. </w:t>
+            </w:r>
+            <w:r>
+              <w:rPr>
+                <w:b/>
+              </w:rPr>
+              <w:t>M0</w:t>
+            </w:r>
+            <w:r>
+              <w:t xml:space="preserve"> mobile foundation CSS shipped (</w:t>
+            </w:r>
+            <w:r>
+              <w:rPr>
+                <w:rFonts w:ascii="Consolas" w:hAnsi="Consolas"/>
+                <w:sz w:val="20"/>
+              </w:rPr>
+              <w:t>base.html</w:t>
+            </w:r>
+            <w:r>
+              <w:t xml:space="preserve">: 16px inputs, 1-col forms, overflow-x, safe-area tokens). M1–M4 still planned — </w:t>
+            </w:r>
+            <w:r>
+              <w:rPr>
+                <w:rFonts w:ascii="Consolas" w:hAnsi="Consolas"/>
+                <w:sz w:val="20"/>
+              </w:rPr>
+              <w:t>docs/MOBILE.md</w:t>
             </w:r>
           </w:p>
         </w:tc>
@@ -1288,13 +1377,22 @@
       </w:r>
       <w:r>
         <w:rPr>
+          <w:b/>
+        </w:rPr>
+        <w:t>slim</w:t>
+      </w:r>
+      <w:r>
+        <w:t xml:space="preserve"> </w:t>
+      </w:r>
+      <w:r>
+        <w:rPr>
           <w:rFonts w:ascii="Consolas" w:hAnsi="Consolas"/>
           <w:sz w:val="20"/>
         </w:rPr>
         <w:t>last_problem_payload</w:t>
       </w:r>
       <w:r>
-        <w:t xml:space="preserve"> (web) or returned in API JSON.</w:t>
+        <w:t xml:space="preserve"> (grading keys; bulky SVG/HTML dropped) for web check/MCQ trust.</w:t>
       </w:r>
     </w:p>
     <w:p>
@@ -1308,7 +1406,7 @@
         <w:t>MCQ:</w:t>
       </w:r>
       <w:r>
-        <w:t xml:space="preserve"> client posts answer → </w:t>
+        <w:t xml:space="preserve"> client posts chosen letter → </w:t>
       </w:r>
       <w:r>
         <w:rPr>
@@ -1316,6 +1414,25 @@
           <w:sz w:val="20"/>
         </w:rPr>
         <w:t>POST /api/v1/generator/mcq-answer</w:t>
+      </w:r>
+      <w:r>
+        <w:t xml:space="preserve"> → </w:t>
+      </w:r>
+      <w:r>
+        <w:rPr>
+          <w:b/>
+        </w:rPr>
+        <w:t>server</w:t>
+      </w:r>
+      <w:r>
+        <w:t xml:space="preserve"> compares to session </w:t>
+      </w:r>
+      <w:r>
+        <w:rPr>
+          <w:rFonts w:ascii="Consolas" w:hAnsi="Consolas"/>
+          <w:sz w:val="20"/>
+        </w:rPr>
+        <w:t>correct_answer</w:t>
       </w:r>
       <w:r>
         <w:t>.</w:t>
@@ -1352,17 +1469,7 @@
         <w:t>check_answer()</w:t>
       </w:r>
       <w:r>
-        <w:t xml:space="preserve"> in </w:t>
-      </w:r>
-      <w:r>
-        <w:rPr>
-          <w:rFonts w:ascii="Consolas" w:hAnsi="Consolas"/>
-          <w:sz w:val="20"/>
-        </w:rPr>
-        <w:t>generators/shared/answer_checkers.py</w:t>
-      </w:r>
-      <w:r>
-        <w:t>.</w:t>
+        <w:t>; SymPy-backed types require session metadata.</w:t>
       </w:r>
     </w:p>
     <w:p>
@@ -1938,7 +2045,16 @@
           <w:p>
             <w:r/>
             <w:r>
-              <w:t>SQLite database (local/dev; backup in production)</w:t>
+              <w:t xml:space="preserve">SQLite database (local/dev only; </w:t>
+            </w:r>
+            <w:r>
+              <w:rPr>
+                <w:b/>
+              </w:rPr>
+              <w:t>not in git</w:t>
+            </w:r>
+            <w:r>
+              <w:t>; backup in production)</w:t>
             </w:r>
           </w:p>
         </w:tc>
@@ -2783,7 +2899,56 @@
         <w:t>session_mismatch</w:t>
       </w:r>
       <w:r>
-        <w:t>).</w:t>
+        <w:t xml:space="preserve">). Types </w:t>
+      </w:r>
+      <w:r>
+        <w:rPr>
+          <w:rFonts w:ascii="Consolas" w:hAnsi="Consolas"/>
+          <w:sz w:val="20"/>
+        </w:rPr>
+        <w:t>algebraic</w:t>
+      </w:r>
+      <w:r>
+        <w:t xml:space="preserve"> and </w:t>
+      </w:r>
+      <w:r>
+        <w:rPr>
+          <w:rFonts w:ascii="Consolas" w:hAnsi="Consolas"/>
+          <w:sz w:val="20"/>
+        </w:rPr>
+        <w:t>quadratic_roots</w:t>
+      </w:r>
+      <w:r>
+        <w:t xml:space="preserve"> </w:t>
+      </w:r>
+      <w:r>
+        <w:rPr>
+          <w:b/>
+        </w:rPr>
+        <w:t>require</w:t>
+      </w:r>
+      <w:r>
+        <w:t xml:space="preserve"> a session problem (</w:t>
+      </w:r>
+      <w:r>
+        <w:rPr>
+          <w:rFonts w:ascii="Consolas" w:hAnsi="Consolas"/>
+          <w:sz w:val="20"/>
+        </w:rPr>
+        <w:t>session_required</w:t>
+      </w:r>
+      <w:r>
+        <w:t xml:space="preserve"> if missing). See </w:t>
+      </w:r>
+      <w:r>
+        <w:rPr>
+          <w:rFonts w:ascii="Consolas" w:hAnsi="Consolas"/>
+          <w:sz w:val="20"/>
+        </w:rPr>
+        <w:t>docs/SOLID_DRAFT_SECURITY.md</w:t>
+      </w:r>
+      <w:r>
+        <w:t>.</w:t>
       </w:r>
     </w:p>
     <w:p>
@@ -4867,6 +5032,27 @@
         <w:t>8. Security and operational concerns</w:t>
       </w:r>
     </w:p>
+    <w:p>
+      <w:r>
+        <w:rPr>
+          <w:b/>
+        </w:rPr>
+        <w:t>Full solid-draft write-up:</w:t>
+      </w:r>
+      <w:r>
+        <w:t xml:space="preserve"> </w:t>
+      </w:r>
+      <w:r>
+        <w:rPr>
+          <w:rFonts w:ascii="Consolas" w:hAnsi="Consolas"/>
+          <w:sz w:val="20"/>
+        </w:rPr>
+        <w:t>docs/SOLID_DRAFT_SECURITY.md</w:t>
+      </w:r>
+      <w:r>
+        <w:t xml:space="preserve"> (SymPy RCE fix, session trust, CSRF, SECRET_KEY, git hygiene).</w:t>
+      </w:r>
+    </w:p>
     <w:tbl>
       <w:tblPr>
         <w:tblStyle w:val="TableGrid"/>
@@ -4920,7 +5106,7 @@
               <w:rPr>
                 <w:b/>
               </w:rPr>
-              <w:t>CSRF</w:t>
+              <w:t>SECRET_KEY</w:t>
             </w:r>
           </w:p>
         </w:tc>
@@ -4931,7 +5117,17 @@
           <w:p>
             <w:r/>
             <w:r>
-              <w:t>Web forms use CSRF tokens</w:t>
+              <w:t xml:space="preserve">Required non-default outside testing; </w:t>
+            </w:r>
+            <w:r>
+              <w:rPr>
+                <w:rFonts w:ascii="Consolas" w:hAnsi="Consolas"/>
+                <w:sz w:val="20"/>
+              </w:rPr>
+              <w:t>PB_ALLOW_DEV_SECRET=1</w:t>
+            </w:r>
+            <w:r>
+              <w:t xml:space="preserve"> local-only</w:t>
             </w:r>
           </w:p>
         </w:tc>
@@ -4947,7 +5143,7 @@
               <w:rPr>
                 <w:b/>
               </w:rPr>
-              <w:t>CSP</w:t>
+              <w:t>SymPy grading</w:t>
             </w:r>
           </w:p>
         </w:tc>
@@ -4958,7 +5154,7 @@
           <w:p>
             <w:r/>
             <w:r>
-              <w:t>Content-Security-Policy on responses; Pyodide lessons add COOP/COEP</w:t>
+              <w:t>Allowlisted safe parser; check API session-bound for SymPy types</w:t>
             </w:r>
           </w:p>
         </w:tc>
@@ -4974,7 +5170,7 @@
               <w:rPr>
                 <w:b/>
               </w:rPr>
-              <w:t>Rate limits</w:t>
+              <w:t>CSRF</w:t>
             </w:r>
           </w:p>
         </w:tc>
@@ -4985,17 +5181,27 @@
           <w:p>
             <w:r/>
             <w:r>
-              <w:t>Daily buckets per user/IP (</w:t>
+              <w:t xml:space="preserve">Web forms + cookie-session </w:t>
             </w:r>
             <w:r>
               <w:rPr>
                 <w:rFonts w:ascii="Consolas" w:hAnsi="Consolas"/>
                 <w:sz w:val="20"/>
               </w:rPr>
-              <w:t>models/rate_limit.py</w:t>
-            </w:r>
-            <w:r>
-              <w:t>)</w:t>
+              <w:t>/api/*</w:t>
+            </w:r>
+            <w:r>
+              <w:t xml:space="preserve"> mutations; Bearer / </w:t>
+            </w:r>
+            <w:r>
+              <w:rPr>
+                <w:rFonts w:ascii="Consolas" w:hAnsi="Consolas"/>
+                <w:sz w:val="20"/>
+              </w:rPr>
+              <w:t>PB_TESTING</w:t>
+            </w:r>
+            <w:r>
+              <w:t xml:space="preserve"> exempt</w:t>
             </w:r>
           </w:p>
         </w:tc>
@@ -5011,7 +5217,7 @@
               <w:rPr>
                 <w:b/>
               </w:rPr>
-              <w:t>Cookies</w:t>
+              <w:t>CSP</w:t>
             </w:r>
           </w:p>
         </w:tc>
@@ -5022,7 +5228,7 @@
           <w:p>
             <w:r/>
             <w:r>
-              <w:t>HttpOnly, SameSite=Lax</w:t>
+              <w:t>Content-Security-Policy on responses; MathJax/Pyodide still need unsafe-eval/wasm; CDN SRI where applied</w:t>
             </w:r>
           </w:p>
         </w:tc>
@@ -5038,7 +5244,7 @@
               <w:rPr>
                 <w:b/>
               </w:rPr>
-              <w:t>CORS</w:t>
+              <w:t>Rate limits</w:t>
             </w:r>
           </w:p>
         </w:tc>
@@ -5049,17 +5255,17 @@
           <w:p>
             <w:r/>
             <w:r>
-              <w:t xml:space="preserve">Optional </w:t>
+              <w:t>Daily UTC buckets per user or IP (</w:t>
             </w:r>
             <w:r>
               <w:rPr>
                 <w:rFonts w:ascii="Consolas" w:hAnsi="Consolas"/>
                 <w:sz w:val="20"/>
               </w:rPr>
-              <w:t>CORS_ORIGINS</w:t>
-            </w:r>
-            <w:r>
-              <w:t xml:space="preserve"> for separate frontends</w:t>
+              <w:t>models/rate_limit.py</w:t>
+            </w:r>
+            <w:r>
+              <w:t>); web auth included</w:t>
             </w:r>
           </w:p>
         </w:tc>
@@ -5075,7 +5281,7 @@
               <w:rPr>
                 <w:b/>
               </w:rPr>
-              <w:t>Testing</w:t>
+              <w:t>Cookies</w:t>
             </w:r>
           </w:p>
         </w:tc>
@@ -5086,6 +5292,104 @@
           <w:p>
             <w:r/>
             <w:r>
+              <w:t xml:space="preserve">HttpOnly, SameSite=Lax; Secure when HTTPS / </w:t>
+            </w:r>
+            <w:r>
+              <w:rPr>
+                <w:rFonts w:ascii="Consolas" w:hAnsi="Consolas"/>
+                <w:sz w:val="20"/>
+              </w:rPr>
+              <w:t>SESSION_COOKIE_SECURE</w:t>
+            </w:r>
+          </w:p>
+        </w:tc>
+      </w:tr>
+      <w:tr>
+        <w:tc>
+          <w:tcPr>
+            <w:tcW w:type="dxa" w:w="4320"/>
+          </w:tcPr>
+          <w:p>
+            <w:r/>
+            <w:r>
+              <w:rPr>
+                <w:b/>
+              </w:rPr>
+              <w:t>CORS</w:t>
+            </w:r>
+          </w:p>
+        </w:tc>
+        <w:tc>
+          <w:tcPr>
+            <w:tcW w:type="dxa" w:w="4320"/>
+          </w:tcPr>
+          <w:p>
+            <w:r/>
+            <w:r>
+              <w:t xml:space="preserve">Optional </w:t>
+            </w:r>
+            <w:r>
+              <w:rPr>
+                <w:rFonts w:ascii="Consolas" w:hAnsi="Consolas"/>
+                <w:sz w:val="20"/>
+              </w:rPr>
+              <w:t>CORS_ORIGINS</w:t>
+            </w:r>
+            <w:r>
+              <w:t xml:space="preserve"> for separate frontends</w:t>
+            </w:r>
+          </w:p>
+        </w:tc>
+      </w:tr>
+      <w:tr>
+        <w:tc>
+          <w:tcPr>
+            <w:tcW w:type="dxa" w:w="4320"/>
+          </w:tcPr>
+          <w:p>
+            <w:r/>
+            <w:r>
+              <w:rPr>
+                <w:b/>
+              </w:rPr>
+              <w:t>DB</w:t>
+            </w:r>
+          </w:p>
+        </w:tc>
+        <w:tc>
+          <w:tcPr>
+            <w:tcW w:type="dxa" w:w="4320"/>
+          </w:tcPr>
+          <w:p>
+            <w:r/>
+            <w:r>
+              <w:t>Request-scoped connections, WAL, busy_timeout; DB files gitignored</w:t>
+            </w:r>
+          </w:p>
+        </w:tc>
+      </w:tr>
+      <w:tr>
+        <w:tc>
+          <w:tcPr>
+            <w:tcW w:type="dxa" w:w="4320"/>
+          </w:tcPr>
+          <w:p>
+            <w:r/>
+            <w:r>
+              <w:rPr>
+                <w:b/>
+              </w:rPr>
+              <w:t>Testing</w:t>
+            </w:r>
+          </w:p>
+        </w:tc>
+        <w:tc>
+          <w:tcPr>
+            <w:tcW w:type="dxa" w:w="4320"/>
+          </w:tcPr>
+          <w:p>
+            <w:r/>
+            <w:r>
               <w:rPr>
                 <w:rFonts w:ascii="Consolas" w:hAnsi="Consolas"/>
                 <w:sz w:val="20"/>
@@ -5093,7 +5397,7 @@
               <w:t>PB_TESTING=1</w:t>
             </w:r>
             <w:r>
-              <w:t xml:space="preserve"> disables rate limits (dev/smoke only)</w:t>
+              <w:t xml:space="preserve"> → ephemeral DB + limit/CSRF exemptions (smoke only)</w:t>
             </w:r>
           </w:p>
         </w:tc>
@@ -5449,7 +5753,7 @@
                 <w:rFonts w:ascii="Consolas" w:hAnsi="Consolas"/>
                 <w:sz w:val="20"/>
               </w:rPr>
-              <w:t>docs/API.md</w:t>
+              <w:t>docs/AI_HANDOFF.md</w:t>
             </w:r>
           </w:p>
         </w:tc>
@@ -5460,7 +5764,13 @@
           <w:p>
             <w:r/>
             <w:r>
-              <w:t>REST API v1 contract</w:t>
+              <w:rPr>
+                <w:b/>
+              </w:rPr>
+              <w:t>Start here for AI agents</w:t>
+            </w:r>
+            <w:r>
+              <w:t xml:space="preserve"> — status, reading order, invariants, engagement E1–E3</w:t>
             </w:r>
           </w:p>
         </w:tc>
@@ -5477,7 +5787,7 @@
                 <w:rFonts w:ascii="Consolas" w:hAnsi="Consolas"/>
                 <w:sz w:val="20"/>
               </w:rPr>
-              <w:t>docs/DEPLOY.md</w:t>
+              <w:t>docs/COMPLEX_MECHANISMS.md</w:t>
             </w:r>
           </w:p>
         </w:tc>
@@ -5488,7 +5798,7 @@
           <w:p>
             <w:r/>
             <w:r>
-              <w:t>Production deployment checklist</w:t>
+              <w:t>How the three hardest subsystems work (grading, queues, Phase G)</w:t>
             </w:r>
           </w:p>
         </w:tc>
@@ -5505,7 +5815,7 @@
                 <w:rFonts w:ascii="Consolas" w:hAnsi="Consolas"/>
                 <w:sz w:val="20"/>
               </w:rPr>
-              <w:t>docs/EMAIL_SETUP.md</w:t>
+              <w:t>docs/MOBILE.md</w:t>
             </w:r>
           </w:p>
         </w:tc>
@@ -5516,7 +5826,7 @@
           <w:p>
             <w:r/>
             <w:r>
-              <w:t>Weekly digest configuration</w:t>
+              <w:t>Mobile polish (M0–M4) + Play Android via TWA (M5–M7)</w:t>
             </w:r>
           </w:p>
         </w:tc>
@@ -5533,7 +5843,7 @@
                 <w:rFonts w:ascii="Consolas" w:hAnsi="Consolas"/>
                 <w:sz w:val="20"/>
               </w:rPr>
-              <w:t>docs/POTENTIAL_FUTURE_FUNCTIONALITY.md</w:t>
+              <w:t>docs/SOLID_DRAFT_SECURITY.md</w:t>
             </w:r>
           </w:p>
         </w:tc>
@@ -5544,7 +5854,7 @@
           <w:p>
             <w:r/>
             <w:r>
-              <w:t>Planned features (including teacher/class mode)</w:t>
+              <w:t>Solid-draft audit fixes — do not regress</w:t>
             </w:r>
           </w:p>
         </w:tc>
@@ -5561,10 +5871,7 @@
                 <w:rFonts w:ascii="Consolas" w:hAnsi="Consolas"/>
                 <w:sz w:val="20"/>
               </w:rPr>
-              <w:t>Problem_Bank_AI_Handoff_Plan.md</w:t>
-            </w:r>
-            <w:r>
-              <w:t xml:space="preserve"> (parent dir)</w:t>
+              <w:t>docs/API.md</w:t>
             </w:r>
           </w:p>
         </w:tc>
@@ -5575,7 +5882,91 @@
           <w:p>
             <w:r/>
             <w:r>
-              <w:t>Agent handoff: auto-correct playbook, Phase G order</w:t>
+              <w:t>REST API v1 contract</w:t>
+            </w:r>
+          </w:p>
+        </w:tc>
+      </w:tr>
+      <w:tr>
+        <w:tc>
+          <w:tcPr>
+            <w:tcW w:type="dxa" w:w="4320"/>
+          </w:tcPr>
+          <w:p>
+            <w:r/>
+            <w:r>
+              <w:rPr>
+                <w:rFonts w:ascii="Consolas" w:hAnsi="Consolas"/>
+                <w:sz w:val="20"/>
+              </w:rPr>
+              <w:t>docs/DEPLOY.md</w:t>
+            </w:r>
+          </w:p>
+        </w:tc>
+        <w:tc>
+          <w:tcPr>
+            <w:tcW w:type="dxa" w:w="4320"/>
+          </w:tcPr>
+          <w:p>
+            <w:r/>
+            <w:r>
+              <w:t>Production deployment checklist</w:t>
+            </w:r>
+          </w:p>
+        </w:tc>
+      </w:tr>
+      <w:tr>
+        <w:tc>
+          <w:tcPr>
+            <w:tcW w:type="dxa" w:w="4320"/>
+          </w:tcPr>
+          <w:p>
+            <w:r/>
+            <w:r>
+              <w:rPr>
+                <w:rFonts w:ascii="Consolas" w:hAnsi="Consolas"/>
+                <w:sz w:val="20"/>
+              </w:rPr>
+              <w:t>docs/EMAIL_SETUP.md</w:t>
+            </w:r>
+          </w:p>
+        </w:tc>
+        <w:tc>
+          <w:tcPr>
+            <w:tcW w:type="dxa" w:w="4320"/>
+          </w:tcPr>
+          <w:p>
+            <w:r/>
+            <w:r>
+              <w:t>Weekly digest configuration</w:t>
+            </w:r>
+          </w:p>
+        </w:tc>
+      </w:tr>
+      <w:tr>
+        <w:tc>
+          <w:tcPr>
+            <w:tcW w:type="dxa" w:w="4320"/>
+          </w:tcPr>
+          <w:p>
+            <w:r/>
+            <w:r>
+              <w:rPr>
+                <w:rFonts w:ascii="Consolas" w:hAnsi="Consolas"/>
+                <w:sz w:val="20"/>
+              </w:rPr>
+              <w:t>docs/POTENTIAL_FUTURE_FUNCTIONALITY.md</w:t>
+            </w:r>
+          </w:p>
+        </w:tc>
+        <w:tc>
+          <w:tcPr>
+            <w:tcW w:type="dxa" w:w="4320"/>
+          </w:tcPr>
+          <w:p>
+            <w:r/>
+            <w:r>
+              <w:t>G8, engagement E4, other future ideas</w:t>
             </w:r>
           </w:p>
         </w:tc>
@@ -5602,7 +5993,16 @@
         <w:t>Do not rebuild</w:t>
       </w:r>
       <w:r>
-        <w:t xml:space="preserve"> checker infrastructure or G1–G7 features — extend them.</w:t>
+        <w:t xml:space="preserve"> checker infrastructure or G1–G7 features — extend them. </w:t>
+      </w:r>
+      <w:r>
+        <w:rPr>
+          <w:b/>
+        </w:rPr>
+        <w:t>Do not regress</w:t>
+      </w:r>
+      <w:r>
+        <w:t xml:space="preserve"> solid-draft security invariants.</w:t>
       </w:r>
     </w:p>
     <w:p>
@@ -5658,7 +6058,7 @@
         <w:t>python scripts/run_smoke_tests.py</w:t>
       </w:r>
       <w:r>
-        <w:t xml:space="preserve"> before deploy.</w:t>
+        <w:t xml:space="preserve"> before deploy (includes SymPy security smoke).</w:t>
       </w:r>
     </w:p>
     <w:p>
@@ -5715,6 +6115,34 @@
       </w:r>
       <w:r>
         <w:t xml:space="preserve"> and templates as needed.</w:t>
+      </w:r>
+    </w:p>
+    <w:p>
+      <w:pPr>
+        <w:pStyle w:val="ListNumber"/>
+      </w:pPr>
+      <w:r>
+        <w:t xml:space="preserve">Never commit </w:t>
+      </w:r>
+      <w:r>
+        <w:rPr>
+          <w:rFonts w:ascii="Consolas" w:hAnsi="Consolas"/>
+          <w:sz w:val="20"/>
+        </w:rPr>
+        <w:t>data/*.db</w:t>
+      </w:r>
+      <w:r>
+        <w:t xml:space="preserve"> or </w:t>
+      </w:r>
+      <w:r>
+        <w:rPr>
+          <w:rFonts w:ascii="Consolas" w:hAnsi="Consolas"/>
+          <w:sz w:val="20"/>
+        </w:rPr>
+        <w:t>*.bak</w:t>
+      </w:r>
+      <w:r>
+        <w:t>.</w:t>
       </w:r>
     </w:p>
     <w:sectPr>

</xml_diff>

<commit_message>
Fix QOTD grading and keep it as a difficult daily challenge that counts for streak only.
Co-authored-by: Cursor <cursoragent@cursor.com>
</commit_message>
<xml_diff>
--- a/docs/ARCHITECTURE.docx
+++ b/docs/ARCHITECTURE.docx
@@ -3564,7 +3564,16 @@
           <w:p>
             <w:r/>
             <w:r>
-              <w:t xml:space="preserve">Daily MCQ + friend leaderboard; </w:t>
+              <w:t xml:space="preserve">One </w:t>
+            </w:r>
+            <w:r>
+              <w:rPr>
+                <w:b/>
+              </w:rPr>
+              <w:t>difficult</w:t>
+            </w:r>
+            <w:r>
+              <w:t xml:space="preserve"> MCQ per UTC day + friend leaderboard; </w:t>
             </w:r>
             <w:r>
               <w:rPr>
@@ -3574,7 +3583,7 @@
               <w:t>@problem_bot</w:t>
             </w:r>
             <w:r>
-              <w:t xml:space="preserve"> feed card (E1)</w:t>
+              <w:t xml:space="preserve"> feed card (E1). Counts for study streak only — not topic / MCQ history. Wrong answers show the worked solution.</w:t>
             </w:r>
           </w:p>
         </w:tc>

</xml_diff>